<commit_message>
Telot Thesis Planning Documents v7 - SRL Stripped-3.docx
</commit_message>
<xml_diff>
--- a/Claude outputs/Telot Thesis Planning Documents v7 - SRL Stripped-3.docx
+++ b/Claude outputs/Telot Thesis Planning Documents v7 - SRL Stripped-3.docx
@@ -164,7 +164,25 @@
           <w:sz w:val="24"/>
           <w:szCs w:val="24"/>
         </w:rPr>
-        <w:t>Recent advances in Large Language Models (LLMs) provide new opportunities to support cross-session exploratory search (An 2025; Yang et al. 2025). However, existing AI-assisted search systems primarily emphasize answer generation and automated summarization (Luo et al. 2025; Yang et al. 2025), which may reduce opportunities for users to actively engage in reflection, sensemaking, and knowledge construction (Crescenzi et al. 2021; Zhu et al. 2026).</w:t>
+        <w:t>Recent advances in Large Language Models (LLMs) provide new opportunities to support cross-session exploratory search (</w:t>
+      </w:r>
+      <w:proofErr w:type="gramStart"/>
+      <w:r>
+        <w:rPr>
+          <w:rFonts w:ascii="Aptos" w:eastAsia="Aptos" w:hAnsi="Aptos" w:cs="Aptos"/>
+          <w:sz w:val="24"/>
+          <w:szCs w:val="24"/>
+        </w:rPr>
+        <w:t>An</w:t>
+      </w:r>
+      <w:proofErr w:type="gramEnd"/>
+      <w:r>
+        <w:rPr>
+          <w:rFonts w:ascii="Aptos" w:eastAsia="Aptos" w:hAnsi="Aptos" w:cs="Aptos"/>
+          <w:sz w:val="24"/>
+          <w:szCs w:val="24"/>
+        </w:rPr>
+        <w:t xml:space="preserve"> 2025; Yang et al. 2025). However, existing AI-assisted search systems primarily emphasize answer generation and automated summarization (Luo et al. 2025; Yang et al. 2025), which may reduce opportunities for users to actively engage in reflection, sensemaking, and knowledge construction (Crescenzi et al. 2021; Zhu et al. 2026).</w:t>
       </w:r>
     </w:p>
     <w:p>
@@ -274,7 +292,61 @@
           <w:sz w:val="24"/>
           <w:szCs w:val="24"/>
         </w:rPr>
-        <w:t>Consider Jamie Chen, a first-year undergraduate in the Geography and Environmental Studies program at the University of Regina who has dyslexia. For a course project in an Urban Planning module, Jamie has been assigned to explore how green spaces, such as public parks, community gardens, tree-lined streets, and conservation areas, affect human well-being, and to save a diverse set of high-quality sources for closer reading later rather than reading each one in full during the search itself. In an initial session, Jamie issues several exploratory queries, rereading and rewording each one before settling on a phrasing Jamie is confident is spelled and worded correctly, skims a dozen results, and saves a handful of promising sources, gradually realizing that the topic involves an unanticipated policy dimension. Even after finding useful material, Jamie's sense of whether the search is actually going well stays uncertain rather than settling, a pattern documented among undergraduate searchers with dyslexia specifically (Beveridge et al. 2022). After a two-day interruption for other coursework, Jamie returns to the task but can no longer recall which sources addressed which sub-question, why certain results were saved, or what remained unresolved; reconstructing this context consumes a disproportionate share of the second session before new search activity can resume (Li et al. 2020). Holding the original goal, the partial findings, and a new search direction in mind all at once taxes working memory further, making it more likely that progress is lost or that promising threads are abandoned rather than revisited (Choi and Arguello 2025). This scenario illustrates the central challenge addressed by this thesis: exploratory search interfaces typically preserve access to prior artifacts  documents, queries, bookmarks  but rarely preserve the reasoning and cognitive context a searcher like Jamie needs to resume effectively.</w:t>
+        <w:t xml:space="preserve">Consider Jamie Chen, a first-year undergraduate in the Geography and Environmental Studies program at the University of Regina who has dyslexia. For a course project in an Urban Planning module, Jamie has been assigned to explore how green spaces, such as public parks, community gardens, tree-lined streets, and conservation areas, affect human well-being, and to save a diverse set of high-quality sources for closer reading later rather than reading each one in full during the search itself. In an initial session, Jamie issues several exploratory queries, rereading and rewording each one before settling on a phrasing Jamie is confident is spelled and worded correctly, skims a dozen results, and saves a handful of promising sources, gradually realizing that the topic involves an unanticipated policy dimension. Even after finding useful material, Jamie's sense of whether the search is </w:t>
+      </w:r>
+      <w:proofErr w:type="gramStart"/>
+      <w:r>
+        <w:rPr>
+          <w:rFonts w:ascii="Aptos" w:eastAsia="Aptos" w:hAnsi="Aptos" w:cs="Aptos"/>
+          <w:sz w:val="24"/>
+          <w:szCs w:val="24"/>
+        </w:rPr>
+        <w:t>actually going</w:t>
+      </w:r>
+      <w:proofErr w:type="gramEnd"/>
+      <w:r>
+        <w:rPr>
+          <w:rFonts w:ascii="Aptos" w:eastAsia="Aptos" w:hAnsi="Aptos" w:cs="Aptos"/>
+          <w:sz w:val="24"/>
+          <w:szCs w:val="24"/>
+        </w:rPr>
+        <w:t xml:space="preserve"> well stays uncertain rather than settling, a pattern documented among undergraduate searchers with dyslexia specifically (Beveridge et al. 2022). After a two-day interruption for other coursework, Jamie returns to the task but can no longer recall which sources addressed which sub-question, why certain results were saved, or what remained unresolved; reconstructing this context consumes a disproportionate share of the second session before new search activity can resume (Li et al. 2020). Holding the original goal, the partial findings, and a new search direction in mind all at once taxes working memory further, making it more likely that progress is lost or that promising threads are abandoned rather than revisited (Choi and Arguello 2025). This scenario illustrates the central challenge addressed by this thesis: exploratory search interfaces typically preserve access to prior </w:t>
+      </w:r>
+      <w:proofErr w:type="gramStart"/>
+      <w:r>
+        <w:rPr>
+          <w:rFonts w:ascii="Aptos" w:eastAsia="Aptos" w:hAnsi="Aptos" w:cs="Aptos"/>
+          <w:sz w:val="24"/>
+          <w:szCs w:val="24"/>
+        </w:rPr>
+        <w:t>artifacts  documents</w:t>
+      </w:r>
+      <w:proofErr w:type="gramEnd"/>
+      <w:r>
+        <w:rPr>
+          <w:rFonts w:ascii="Aptos" w:eastAsia="Aptos" w:hAnsi="Aptos" w:cs="Aptos"/>
+          <w:sz w:val="24"/>
+          <w:szCs w:val="24"/>
+        </w:rPr>
+        <w:t xml:space="preserve">, queries, </w:t>
+      </w:r>
+      <w:proofErr w:type="gramStart"/>
+      <w:r>
+        <w:rPr>
+          <w:rFonts w:ascii="Aptos" w:eastAsia="Aptos" w:hAnsi="Aptos" w:cs="Aptos"/>
+          <w:sz w:val="24"/>
+          <w:szCs w:val="24"/>
+        </w:rPr>
+        <w:t>bookmarks  but</w:t>
+      </w:r>
+      <w:proofErr w:type="gramEnd"/>
+      <w:r>
+        <w:rPr>
+          <w:rFonts w:ascii="Aptos" w:eastAsia="Aptos" w:hAnsi="Aptos" w:cs="Aptos"/>
+          <w:sz w:val="24"/>
+          <w:szCs w:val="24"/>
+        </w:rPr>
+        <w:t xml:space="preserve"> rarely preserve the reasoning and cognitive context a searcher like Jamie needs to resume effectively.</w:t>
       </w:r>
     </w:p>
     <w:p>
@@ -437,7 +509,25 @@
           <w:sz w:val="24"/>
           <w:szCs w:val="24"/>
         </w:rPr>
-        <w:t>Recent developments in generative AI introduce new opportunities for supporting these challenges. LLM-based systems can maintain contextual summaries, identify relationships among information, provide reflective prompts, and support task management across sessions (An 2025; Katz et al. 2024; Yang et al. 2025; Zhu et al. 2026). However, existing approaches also raise concerns about whether automated synthesis may bypass users' own exploration and evaluation processes, potentially reducing opportunities for learning and metacognitive engagement (Luo et al. 2025). Therefore, effective GenAI support requires balancing cognitive assistance with preservation of user agency.</w:t>
+        <w:t>Recent developments in generative AI introduce new opportunities for supporting these challenges. LLM-based systems can maintain contextual summaries, identify relationships among information, provide reflective prompts, and support task management across sessions (</w:t>
+      </w:r>
+      <w:proofErr w:type="gramStart"/>
+      <w:r>
+        <w:rPr>
+          <w:rFonts w:ascii="Aptos" w:eastAsia="Aptos" w:hAnsi="Aptos" w:cs="Aptos"/>
+          <w:sz w:val="24"/>
+          <w:szCs w:val="24"/>
+        </w:rPr>
+        <w:t>An</w:t>
+      </w:r>
+      <w:proofErr w:type="gramEnd"/>
+      <w:r>
+        <w:rPr>
+          <w:rFonts w:ascii="Aptos" w:eastAsia="Aptos" w:hAnsi="Aptos" w:cs="Aptos"/>
+          <w:sz w:val="24"/>
+          <w:szCs w:val="24"/>
+        </w:rPr>
+        <w:t xml:space="preserve"> 2025; Katz et al. 2024; Yang et al. 2025; Zhu et al. 2026). However, existing approaches also raise concerns about whether automated synthesis may bypass users' own exploration and evaluation processes, potentially reducing opportunities for learning and metacognitive engagement (Luo et al. 2025). Therefore, effective GenAI support requires balancing cognitive assistance with preservation of user agency.</w:t>
       </w:r>
     </w:p>
     <w:p>
@@ -522,7 +612,25 @@
           <w:sz w:val="24"/>
           <w:szCs w:val="24"/>
         </w:rPr>
-        <w:t>Complex information seeking tasks differ from traditional lookup tasks because users must progressively develop an understanding of an unfamiliar information space, refine their goals, evaluate evidence, and determine future directions as their knowledge evolves (Hoeber 2025). Such tasks are inherently iterative and non-linear, requiring users to continuously manage both the information they discover and the cognitive processes involved in exploration (Hoeber and Shukla 2021; Hoeber, Pirmoradi, et al. 2024).</w:t>
+        <w:t xml:space="preserve">Complex information seeking tasks differ from traditional lookup tasks because users must progressively develop an understanding of an unfamiliar information space, refine their goals, evaluate evidence, and determine future directions as their knowledge evolves (Hoeber 2025). Such tasks are inherently iterative and non-linear, requiring users to continuously manage both the information they </w:t>
+      </w:r>
+      <w:proofErr w:type="gramStart"/>
+      <w:r>
+        <w:rPr>
+          <w:rFonts w:ascii="Aptos" w:eastAsia="Aptos" w:hAnsi="Aptos" w:cs="Aptos"/>
+          <w:sz w:val="24"/>
+          <w:szCs w:val="24"/>
+        </w:rPr>
+        <w:t>discover</w:t>
+      </w:r>
+      <w:proofErr w:type="gramEnd"/>
+      <w:r>
+        <w:rPr>
+          <w:rFonts w:ascii="Aptos" w:eastAsia="Aptos" w:hAnsi="Aptos" w:cs="Aptos"/>
+          <w:sz w:val="24"/>
+          <w:szCs w:val="24"/>
+        </w:rPr>
+        <w:t xml:space="preserve"> and the cognitive processes involved in exploration (Hoeber and Shukla 2021; Hoeber, Pirmoradi, et al. 2024).</w:t>
       </w:r>
     </w:p>
     <w:p>
@@ -558,7 +666,25 @@
           <w:sz w:val="24"/>
           <w:szCs w:val="24"/>
         </w:rPr>
-        <w:t xml:space="preserve">The use of external representations, however, introduces an important design consideration. While external tools can reduce cognitive demands by allowing users to offload information, excessive dependence on external support may influence how individuals engage with memory and reasoning processes. Risko and Gilbert describe this phenomenon as cognitive offloading, where people use external resources to reduce internal cognitive effort, while noting that such strategies may alter how information is </w:t>
+        <w:t xml:space="preserve">The use of external representations, however, introduces </w:t>
+      </w:r>
+      <w:proofErr w:type="gramStart"/>
+      <w:r>
+        <w:rPr>
+          <w:rFonts w:ascii="Aptos" w:eastAsia="Aptos" w:hAnsi="Aptos" w:cs="Aptos"/>
+          <w:sz w:val="24"/>
+          <w:szCs w:val="24"/>
+        </w:rPr>
+        <w:t>an important</w:t>
+      </w:r>
+      <w:proofErr w:type="gramEnd"/>
+      <w:r>
+        <w:rPr>
+          <w:rFonts w:ascii="Aptos" w:eastAsia="Aptos" w:hAnsi="Aptos" w:cs="Aptos"/>
+          <w:sz w:val="24"/>
+          <w:szCs w:val="24"/>
+        </w:rPr>
+        <w:t xml:space="preserve"> design consideration. While external tools can reduce cognitive demands by allowing users to offload information, excessive dependence on external support may influence how individuals engage with memory and reasoning processes. Risko and Gilbert describe this phenomenon as cognitive offloading, where people use external resources to reduce internal cognitive effort, while noting that such strategies may alter how information is </w:t>
       </w:r>
       <w:r>
         <w:rPr>
@@ -1143,7 +1269,43 @@
           <w:sz w:val="24"/>
           <w:szCs w:val="24"/>
         </w:rPr>
-        <w:t>Beyond interactive assistance, recent work has investigated whether LLMs can maintain cognitive context across extended tasks. An proposed the Cognitive Workspace concept, where an LLM maintains an external representation of task-related information, including goals, intermediate findings, and contextual state (An 2025). Although this work is currently conceptual, it highlights the possibility of using LLMs as dynamic external memory systems that support continuity during complex activities.</w:t>
+        <w:t xml:space="preserve">Beyond interactive assistance, recent work has investigated whether LLMs can maintain cognitive context across extended tasks. </w:t>
+      </w:r>
+      <w:proofErr w:type="gramStart"/>
+      <w:r>
+        <w:rPr>
+          <w:rFonts w:ascii="Aptos" w:eastAsia="Aptos" w:hAnsi="Aptos" w:cs="Aptos"/>
+          <w:sz w:val="24"/>
+          <w:szCs w:val="24"/>
+        </w:rPr>
+        <w:t>An</w:t>
+      </w:r>
+      <w:proofErr w:type="gramEnd"/>
+      <w:r>
+        <w:rPr>
+          <w:rFonts w:ascii="Aptos" w:eastAsia="Aptos" w:hAnsi="Aptos" w:cs="Aptos"/>
+          <w:sz w:val="24"/>
+          <w:szCs w:val="24"/>
+        </w:rPr>
+        <w:t xml:space="preserve"> proposed the Cognitive Workspace concept, where an LLM maintains an external representation of task-related information, including goals, intermediate findings, and contextual state (</w:t>
+      </w:r>
+      <w:proofErr w:type="gramStart"/>
+      <w:r>
+        <w:rPr>
+          <w:rFonts w:ascii="Aptos" w:eastAsia="Aptos" w:hAnsi="Aptos" w:cs="Aptos"/>
+          <w:sz w:val="24"/>
+          <w:szCs w:val="24"/>
+        </w:rPr>
+        <w:t>An</w:t>
+      </w:r>
+      <w:proofErr w:type="gramEnd"/>
+      <w:r>
+        <w:rPr>
+          <w:rFonts w:ascii="Aptos" w:eastAsia="Aptos" w:hAnsi="Aptos" w:cs="Aptos"/>
+          <w:sz w:val="24"/>
+          <w:szCs w:val="24"/>
+        </w:rPr>
+        <w:t xml:space="preserve"> 2025). Although this work is currently conceptual, it highlights the possibility of using LLMs as dynamic external memory systems that support continuity during complex activities.</w:t>
       </w:r>
     </w:p>
     <w:p>
@@ -1266,7 +1428,25 @@
           <w:sz w:val="24"/>
           <w:szCs w:val="24"/>
         </w:rPr>
-        <w:t>Complex exploratory search tasks frequently extend beyond a single interaction period because users require time to gather information, process findings, consult additional resources, or reconsider their initial direction. Cross-session search refers to information-seeking activities where users suspend and later resume a search task across multiple sessions, potentially separated by minutes, hours, days, or longer periods (Li et al. 2020; Gomes et al. 2022). Unlike single-session search, cross-session search introduces an additional cognitive challenge: users must reconstruct their previous understanding, including their original goals, explored pathways, evaluated information, and unresolved questions.</w:t>
+        <w:t xml:space="preserve">Complex </w:t>
+      </w:r>
+      <w:proofErr w:type="gramStart"/>
+      <w:r>
+        <w:rPr>
+          <w:rFonts w:ascii="Aptos" w:eastAsia="Aptos" w:hAnsi="Aptos" w:cs="Aptos"/>
+          <w:sz w:val="24"/>
+          <w:szCs w:val="24"/>
+        </w:rPr>
+        <w:t>exploratory</w:t>
+      </w:r>
+      <w:proofErr w:type="gramEnd"/>
+      <w:r>
+        <w:rPr>
+          <w:rFonts w:ascii="Aptos" w:eastAsia="Aptos" w:hAnsi="Aptos" w:cs="Aptos"/>
+          <w:sz w:val="24"/>
+          <w:szCs w:val="24"/>
+        </w:rPr>
+        <w:t xml:space="preserve"> search tasks frequently extend beyond a single interaction period because users require time to gather information, process findings, consult additional resources, or reconsider their initial direction. Cross-session search refers to information-seeking activities where users suspend and later resume a search task across multiple sessions, potentially separated by minutes, hours, days, or longer periods (Li et al. 2020; Gomes et al. 2022). Unlike single-session search, cross-session search introduces an additional cognitive challenge: users must reconstruct their previous understanding, including their original goals, explored pathways, evaluated information, and unresolved questions.</w:t>
       </w:r>
     </w:p>
     <w:p>
@@ -1486,7 +1666,25 @@
           <w:szCs w:val="24"/>
         </w:rPr>
         <w:lastRenderedPageBreak/>
-        <w:t>task (Li et al. 2020). Rather than assuming that users always want to continue from their last action, effective systems should allow users to inspect previous activity and choose the appropriate point of resumption.</w:t>
+        <w:t xml:space="preserve">task (Li et al. 2020). Rather than </w:t>
+      </w:r>
+      <w:proofErr w:type="gramStart"/>
+      <w:r>
+        <w:rPr>
+          <w:rFonts w:ascii="Aptos" w:eastAsia="Aptos" w:hAnsi="Aptos" w:cs="Aptos"/>
+          <w:sz w:val="24"/>
+          <w:szCs w:val="24"/>
+        </w:rPr>
+        <w:t>assuming that</w:t>
+      </w:r>
+      <w:proofErr w:type="gramEnd"/>
+      <w:r>
+        <w:rPr>
+          <w:rFonts w:ascii="Aptos" w:eastAsia="Aptos" w:hAnsi="Aptos" w:cs="Aptos"/>
+          <w:sz w:val="24"/>
+          <w:szCs w:val="24"/>
+        </w:rPr>
+        <w:t xml:space="preserve"> users always want to continue from their last action, effective systems should allow users to inspect previous activity and choose the appropriate point of resumption.</w:t>
       </w:r>
     </w:p>
     <w:p>
@@ -1693,13 +1891,41 @@
           <w:szCs w:val="28"/>
         </w:rPr>
       </w:pPr>
-      <w:r>
-        <w:rPr>
-          <w:rFonts w:ascii="Aptos" w:eastAsia="Aptos" w:hAnsi="Aptos" w:cs="Aptos"/>
-          <w:sz w:val="24"/>
-          <w:szCs w:val="24"/>
-        </w:rPr>
-        <w:t>An proposed the concept of Cognitive Workspace, where an LLM maintains an external representation of task-related memory, including previous context and intermediate information states (An 2025). Such approaches suggest the possibility of AI systems acting as dynamic cognitive partners that help users recover task context after interruptions. However, these frameworks remain largely conceptual, and empirical evidence regarding their effectiveness in exploratory search scenarios is still limited.</w:t>
+      <w:proofErr w:type="gramStart"/>
+      <w:r>
+        <w:rPr>
+          <w:rFonts w:ascii="Aptos" w:eastAsia="Aptos" w:hAnsi="Aptos" w:cs="Aptos"/>
+          <w:sz w:val="24"/>
+          <w:szCs w:val="24"/>
+        </w:rPr>
+        <w:t>An</w:t>
+      </w:r>
+      <w:proofErr w:type="gramEnd"/>
+      <w:r>
+        <w:rPr>
+          <w:rFonts w:ascii="Aptos" w:eastAsia="Aptos" w:hAnsi="Aptos" w:cs="Aptos"/>
+          <w:sz w:val="24"/>
+          <w:szCs w:val="24"/>
+        </w:rPr>
+        <w:t xml:space="preserve"> proposed the concept of Cognitive Workspace, where an LLM maintains an external representation of task-related memory, including previous context and intermediate information states (</w:t>
+      </w:r>
+      <w:proofErr w:type="gramStart"/>
+      <w:r>
+        <w:rPr>
+          <w:rFonts w:ascii="Aptos" w:eastAsia="Aptos" w:hAnsi="Aptos" w:cs="Aptos"/>
+          <w:sz w:val="24"/>
+          <w:szCs w:val="24"/>
+        </w:rPr>
+        <w:t>An</w:t>
+      </w:r>
+      <w:proofErr w:type="gramEnd"/>
+      <w:r>
+        <w:rPr>
+          <w:rFonts w:ascii="Aptos" w:eastAsia="Aptos" w:hAnsi="Aptos" w:cs="Aptos"/>
+          <w:sz w:val="24"/>
+          <w:szCs w:val="24"/>
+        </w:rPr>
+        <w:t xml:space="preserve"> 2025). Such approaches suggest the possibility of AI systems acting as dynamic cognitive partners that help users recover task context after interruptions. However, these frameworks remain largely conceptual, and empirical evidence regarding their effectiveness in exploratory search scenarios is still limited.</w:t>
       </w:r>
     </w:p>
     <w:p>
@@ -1902,7 +2128,25 @@
           <w:sz w:val="24"/>
           <w:szCs w:val="24"/>
         </w:rPr>
-        <w:t xml:space="preserve">However, the use of external supports introduces important design considerations. According to Risko and Gilbert's theory of cognitive offloading, people naturally use external resources to reduce cognitive demands, such as writing information down instead of memorizing it or using digital tools instead of mental calculation (Risko and Gilbert 2016). Although cognitive offloading can improve task performance by reducing memory requirements, excessive dependence on external systems may reduce active engagement </w:t>
+        <w:t xml:space="preserve">However, the use of external </w:t>
+      </w:r>
+      <w:proofErr w:type="gramStart"/>
+      <w:r>
+        <w:rPr>
+          <w:rFonts w:ascii="Aptos" w:eastAsia="Aptos" w:hAnsi="Aptos" w:cs="Aptos"/>
+          <w:sz w:val="24"/>
+          <w:szCs w:val="24"/>
+        </w:rPr>
+        <w:t>supports</w:t>
+      </w:r>
+      <w:proofErr w:type="gramEnd"/>
+      <w:r>
+        <w:rPr>
+          <w:rFonts w:ascii="Aptos" w:eastAsia="Aptos" w:hAnsi="Aptos" w:cs="Aptos"/>
+          <w:sz w:val="24"/>
+          <w:szCs w:val="24"/>
+        </w:rPr>
+        <w:t xml:space="preserve"> introduces important design considerations. According to Risko and Gilbert's theory of cognitive offloading, people naturally use external resources to reduce cognitive demands, such as writing information down instead of memorizing it or using digital tools instead of mental calculation (Risko and Gilbert 2016). Although cognitive offloading can improve task performance by reducing memory requirements, excessive dependence on external systems may reduce active engagement </w:t>
       </w:r>
       <w:r>
         <w:rPr>
@@ -1970,7 +2214,25 @@
           <w:sz w:val="24"/>
           <w:szCs w:val="24"/>
         </w:rPr>
-        <w:t>Working memory scaffolding aims to reduce unnecessary cognitive demands by externalizing information that users would otherwise need to maintain mentally. Similar to metacognitive scaffolding, the objective is not to replace human cognition but to provide external structures that allow users to focus their limited cognitive resources on higher-level reasoning, interpretation, and decision making.</w:t>
+        <w:t xml:space="preserve">Working memory scaffolding aims to reduce unnecessary cognitive demands by externalizing information that users would otherwise need to maintain mentally. </w:t>
+      </w:r>
+      <w:proofErr w:type="gramStart"/>
+      <w:r>
+        <w:rPr>
+          <w:rFonts w:ascii="Aptos" w:eastAsia="Aptos" w:hAnsi="Aptos" w:cs="Aptos"/>
+          <w:sz w:val="24"/>
+          <w:szCs w:val="24"/>
+        </w:rPr>
+        <w:t>Similar to</w:t>
+      </w:r>
+      <w:proofErr w:type="gramEnd"/>
+      <w:r>
+        <w:rPr>
+          <w:rFonts w:ascii="Aptos" w:eastAsia="Aptos" w:hAnsi="Aptos" w:cs="Aptos"/>
+          <w:sz w:val="24"/>
+          <w:szCs w:val="24"/>
+        </w:rPr>
+        <w:t xml:space="preserve"> metacognitive scaffolding, the objective is not to replace human cognition but to provide external structures that allow users to focus their limited cognitive resources on higher-level reasoning, interpretation, and decision making.</w:t>
       </w:r>
     </w:p>
     <w:p>
@@ -2173,7 +2435,25 @@
           <w:sz w:val="24"/>
           <w:szCs w:val="24"/>
         </w:rPr>
-        <w:t>Similarly, visual relationship techniques such as Visual Keyword/Result Linking expose connections between search terms and retrieved documents, reducing the need for users to remember complex relationships internally (Hoeber, Pirmoradi, et al. 2024). Earlier work by Hoeber and Shukla showed that visually linked keywords can support exploratory browsing by revealing alternative exploration pathways that may not be obvious from traditional ranked lists (Hoeber and Shukla 2021).</w:t>
+        <w:t xml:space="preserve">Similarly, visual relationship techniques such as Visual Keyword/Result Linking expose connections between search terms and retrieved documents, reducing the need for users to remember complex relationships internally (Hoeber, Pirmoradi, et al. 2024). Earlier work by Hoeber and Shukla showed that visually linked keywords can support </w:t>
+      </w:r>
+      <w:proofErr w:type="gramStart"/>
+      <w:r>
+        <w:rPr>
+          <w:rFonts w:ascii="Aptos" w:eastAsia="Aptos" w:hAnsi="Aptos" w:cs="Aptos"/>
+          <w:sz w:val="24"/>
+          <w:szCs w:val="24"/>
+        </w:rPr>
+        <w:t>exploratory</w:t>
+      </w:r>
+      <w:proofErr w:type="gramEnd"/>
+      <w:r>
+        <w:rPr>
+          <w:rFonts w:ascii="Aptos" w:eastAsia="Aptos" w:hAnsi="Aptos" w:cs="Aptos"/>
+          <w:sz w:val="24"/>
+          <w:szCs w:val="24"/>
+        </w:rPr>
+        <w:t xml:space="preserve"> browsing by revealing alternative exploration pathways that may not be obvious from traditional ranked lists (Hoeber and Shukla 2021).</w:t>
       </w:r>
     </w:p>
     <w:p>
@@ -2266,25 +2546,61 @@
           <w:sz w:val="24"/>
           <w:szCs w:val="24"/>
         </w:rPr>
-        <w:t>An proposes the concept of a Cognitive Workspace, where an LLM maintains active memory representations of ongoing tasks and provides continuity across interruptions (An 2025). Such approaches align with cognitive artifact theories by treating AI systems as external cognitive structures that help users manage complex information. However, these approaches remain largely conceptual, and further empirical investigation is required to understand how AI-maintained memory affects human reasoning.</w:t>
-      </w:r>
-    </w:p>
-    <w:p>
-      <w:pPr>
-        <w:spacing w:after="200" w:line="276" w:lineRule="auto"/>
-        <w:rPr>
-          <w:rFonts w:ascii="Aptos" w:eastAsia="Aptos" w:hAnsi="Aptos" w:cs="Aptos"/>
-          <w:sz w:val="28"/>
-          <w:szCs w:val="28"/>
-        </w:rPr>
-      </w:pPr>
-      <w:r>
-        <w:rPr>
-          <w:rFonts w:ascii="Aptos" w:eastAsia="Aptos" w:hAnsi="Aptos" w:cs="Aptos"/>
-          <w:sz w:val="24"/>
-          <w:szCs w:val="24"/>
-        </w:rPr>
-        <w:t>In exploratory search, Katz et al. introduced Knowledge Navigator, an LLM-guided browsing framework that organizes scientific literature into meaningful structures to support exploration of complex information spaces (Katz et al. 2024). Similarly, Search+Chat integrates conversational AI with search interfaces to support learning-oriented search activities by helping users identify possible directions and continue exploration when encountering difficulties (Yang et al. 2025).</w:t>
+        <w:t>An proposes the concept of a Cognitive Workspace, where an LLM maintains active memory representations of ongoing tasks and provides continuity across interruptions (</w:t>
+      </w:r>
+      <w:proofErr w:type="gramStart"/>
+      <w:r>
+        <w:rPr>
+          <w:rFonts w:ascii="Aptos" w:eastAsia="Aptos" w:hAnsi="Aptos" w:cs="Aptos"/>
+          <w:sz w:val="24"/>
+          <w:szCs w:val="24"/>
+        </w:rPr>
+        <w:t>An</w:t>
+      </w:r>
+      <w:proofErr w:type="gramEnd"/>
+      <w:r>
+        <w:rPr>
+          <w:rFonts w:ascii="Aptos" w:eastAsia="Aptos" w:hAnsi="Aptos" w:cs="Aptos"/>
+          <w:sz w:val="24"/>
+          <w:szCs w:val="24"/>
+        </w:rPr>
+        <w:t xml:space="preserve"> 2025). Such approaches align with cognitive artifact theories by treating AI systems as external cognitive structures that help users manage complex information. However, these approaches remain largely conceptual, and further empirical investigation is required to understand how AI-maintained memory affects human reasoning.</w:t>
+      </w:r>
+    </w:p>
+    <w:p>
+      <w:pPr>
+        <w:spacing w:after="200" w:line="276" w:lineRule="auto"/>
+        <w:rPr>
+          <w:rFonts w:ascii="Aptos" w:eastAsia="Aptos" w:hAnsi="Aptos" w:cs="Aptos"/>
+          <w:sz w:val="28"/>
+          <w:szCs w:val="28"/>
+        </w:rPr>
+      </w:pPr>
+      <w:r>
+        <w:rPr>
+          <w:rFonts w:ascii="Aptos" w:eastAsia="Aptos" w:hAnsi="Aptos" w:cs="Aptos"/>
+          <w:sz w:val="24"/>
+          <w:szCs w:val="24"/>
+        </w:rPr>
+        <w:t xml:space="preserve">In exploratory search, Katz et al. introduced Knowledge Navigator, an LLM-guided browsing framework that organizes scientific literature into meaningful structures to support exploration of complex information spaces (Katz et al. 2024). Similarly, </w:t>
+      </w:r>
+      <w:proofErr w:type="gramStart"/>
+      <w:r>
+        <w:rPr>
+          <w:rFonts w:ascii="Aptos" w:eastAsia="Aptos" w:hAnsi="Aptos" w:cs="Aptos"/>
+          <w:sz w:val="24"/>
+          <w:szCs w:val="24"/>
+        </w:rPr>
+        <w:t>Search</w:t>
+      </w:r>
+      <w:proofErr w:type="gramEnd"/>
+      <w:r>
+        <w:rPr>
+          <w:rFonts w:ascii="Aptos" w:eastAsia="Aptos" w:hAnsi="Aptos" w:cs="Aptos"/>
+          <w:sz w:val="24"/>
+          <w:szCs w:val="24"/>
+        </w:rPr>
+        <w:t>+Chat integrates conversational AI with search interfaces to support learning-oriented search activities by helping users identify possible directions and continue exploration when encountering difficulties (Yang et al. 2025).</w:t>
       </w:r>
     </w:p>
     <w:p>
@@ -2339,7 +2655,25 @@
           <w:sz w:val="24"/>
           <w:szCs w:val="24"/>
         </w:rPr>
-        <w:t>Recent studies therefore emphasize the importance of maintaining human agency. Jamshed et al. highlight that neurodivergent students often prefer AI systems that provide flexible assistance rather than replace their personal workflows (Jamshed et al. 2025). Similarly, Zhu et al. demonstrate that GenAI scaffolding can support task management and metacognition when systems provide prompts and awareness rather than automatically controlling the user's process (Zhu et al. 2026).</w:t>
+        <w:t xml:space="preserve">Recent studies therefore emphasize the importance of maintaining human agency. Jamshed et al. </w:t>
+      </w:r>
+      <w:proofErr w:type="gramStart"/>
+      <w:r>
+        <w:rPr>
+          <w:rFonts w:ascii="Aptos" w:eastAsia="Aptos" w:hAnsi="Aptos" w:cs="Aptos"/>
+          <w:sz w:val="24"/>
+          <w:szCs w:val="24"/>
+        </w:rPr>
+        <w:t>highlight</w:t>
+      </w:r>
+      <w:proofErr w:type="gramEnd"/>
+      <w:r>
+        <w:rPr>
+          <w:rFonts w:ascii="Aptos" w:eastAsia="Aptos" w:hAnsi="Aptos" w:cs="Aptos"/>
+          <w:sz w:val="24"/>
+          <w:szCs w:val="24"/>
+        </w:rPr>
+        <w:t xml:space="preserve"> that neurodivergent students often prefer AI systems that provide flexible assistance rather than replace their personal workflows (Jamshed et al. 2025). Similarly, Zhu et al. demonstrate that GenAI scaffolding can support task management and metacognition when systems provide prompts and awareness rather than automatically controlling the user's process (Zhu et al. 2026).</w:t>
       </w:r>
     </w:p>
     <w:p>
@@ -2443,25 +2777,79 @@
           <w:szCs w:val="24"/>
         </w:rPr>
         <w:lastRenderedPageBreak/>
-        <w:t>prompts, and assist users in navigating complex information spaces (An 2025; Yang et al. 2025; Zhu et al. 2026). Two recent studies come closest to integrating these capabilities empirically. Momeni and Hoeber combine embedding-based organization, searcher-authored passage highlighting, and AI-generated summarization into a single aggregated-search workspace and show, with a validated instrument, that the combination outperforms any single capability for metacognitive planning, monitoring, and evaluation as well as cross-session task resumption (Momeni and Hoeber 2026). However, their study targets a general population using a digital humanities aggregated-search task, and does not consider working memory or attention as an individual-difference or accessibility dimension. Conversely, Seihoon et al.'s SearchPath is designed explicitly around the working memory, reading, and attention demands of students with dyslexia, but relies on searcher-authored tagging and a persistent timeline rather than GenAI-generated organization or summarization, and has not yet been evaluated with its target population (Seihoon et al. 2026).</w:t>
-      </w:r>
-    </w:p>
-    <w:p>
-      <w:pPr>
-        <w:spacing w:after="200" w:line="276" w:lineRule="auto"/>
-        <w:rPr>
-          <w:rFonts w:ascii="Aptos" w:eastAsia="Aptos" w:hAnsi="Aptos" w:cs="Aptos"/>
-          <w:sz w:val="28"/>
-          <w:szCs w:val="28"/>
-        </w:rPr>
-      </w:pPr>
-      <w:r>
-        <w:rPr>
-          <w:rFonts w:ascii="Aptos" w:eastAsia="Aptos" w:hAnsi="Aptos" w:cs="Aptos"/>
-          <w:sz w:val="24"/>
-          <w:szCs w:val="24"/>
-        </w:rPr>
-        <w:t>Furthermore, a central unresolved challenge concerns the balance between assistance and agency. Cognitive theories emphasize that external supports should augment human reasoning rather than replace it (Norman 1993; Hutchins 1995). Excessive automation may encourage cognitive offloading that reduces users' engagement with reflection, evaluation, and knowledge construction (Risko and Gilbert 2016). Momeni and Hoeber's finding that grounding AI summaries in searcher-selected highlights preserves metacognitive engagement offers one concrete strategy for managing this tension, but it has not been tested with searchers who have reduced working memory capacity, for whom the assistance-agency balance may need to be struck differently (Momeni and Hoeber 2026; Choi and Arguello 2025).</w:t>
+        <w:t>prompts, and assist users in navigating complex information spaces (</w:t>
+      </w:r>
+      <w:proofErr w:type="gramStart"/>
+      <w:r>
+        <w:rPr>
+          <w:rFonts w:ascii="Aptos" w:eastAsia="Aptos" w:hAnsi="Aptos" w:cs="Aptos"/>
+          <w:sz w:val="24"/>
+          <w:szCs w:val="24"/>
+        </w:rPr>
+        <w:t>An</w:t>
+      </w:r>
+      <w:proofErr w:type="gramEnd"/>
+      <w:r>
+        <w:rPr>
+          <w:rFonts w:ascii="Aptos" w:eastAsia="Aptos" w:hAnsi="Aptos" w:cs="Aptos"/>
+          <w:sz w:val="24"/>
+          <w:szCs w:val="24"/>
+        </w:rPr>
+        <w:t xml:space="preserve"> 2025; Yang et al. 2025; Zhu et al. 2026). Two recent studies come closest to integrating these capabilities empirically. Momeni and Hoeber combine embedding-based organization, searcher-authored passage highlighting, and AI-generated summarization into a single aggregated-search workspace and show, with a validated instrument, that the combination outperforms any single capability for metacognitive planning, monitoring, and evaluation as well as cross-session task resumption (Momeni and Hoeber 2026). However, their study targets a general population using a digital humanities aggregated-search </w:t>
+      </w:r>
+      <w:proofErr w:type="gramStart"/>
+      <w:r>
+        <w:rPr>
+          <w:rFonts w:ascii="Aptos" w:eastAsia="Aptos" w:hAnsi="Aptos" w:cs="Aptos"/>
+          <w:sz w:val="24"/>
+          <w:szCs w:val="24"/>
+        </w:rPr>
+        <w:t>task, and</w:t>
+      </w:r>
+      <w:proofErr w:type="gramEnd"/>
+      <w:r>
+        <w:rPr>
+          <w:rFonts w:ascii="Aptos" w:eastAsia="Aptos" w:hAnsi="Aptos" w:cs="Aptos"/>
+          <w:sz w:val="24"/>
+          <w:szCs w:val="24"/>
+        </w:rPr>
+        <w:t xml:space="preserve"> does not consider working memory or attention as an individual-difference or accessibility dimension. Conversely, Seihoon et al.'s SearchPath is designed explicitly around the working memory, reading, and attention demands of students with dyslexia, but relies on searcher-authored tagging and a persistent timeline rather than GenAI-generated organization or summarization, and has not yet been evaluated with its target population (Seihoon et al. 2026).</w:t>
+      </w:r>
+    </w:p>
+    <w:p>
+      <w:pPr>
+        <w:spacing w:after="200" w:line="276" w:lineRule="auto"/>
+        <w:rPr>
+          <w:rFonts w:ascii="Aptos" w:eastAsia="Aptos" w:hAnsi="Aptos" w:cs="Aptos"/>
+          <w:sz w:val="28"/>
+          <w:szCs w:val="28"/>
+        </w:rPr>
+      </w:pPr>
+      <w:r>
+        <w:rPr>
+          <w:rFonts w:ascii="Aptos" w:eastAsia="Aptos" w:hAnsi="Aptos" w:cs="Aptos"/>
+          <w:sz w:val="24"/>
+          <w:szCs w:val="24"/>
+        </w:rPr>
+        <w:t xml:space="preserve">Furthermore, a central unresolved challenge concerns the balance between assistance and agency. Cognitive theories emphasize that external </w:t>
+      </w:r>
+      <w:proofErr w:type="gramStart"/>
+      <w:r>
+        <w:rPr>
+          <w:rFonts w:ascii="Aptos" w:eastAsia="Aptos" w:hAnsi="Aptos" w:cs="Aptos"/>
+          <w:sz w:val="24"/>
+          <w:szCs w:val="24"/>
+        </w:rPr>
+        <w:t>supports</w:t>
+      </w:r>
+      <w:proofErr w:type="gramEnd"/>
+      <w:r>
+        <w:rPr>
+          <w:rFonts w:ascii="Aptos" w:eastAsia="Aptos" w:hAnsi="Aptos" w:cs="Aptos"/>
+          <w:sz w:val="24"/>
+          <w:szCs w:val="24"/>
+        </w:rPr>
+        <w:t xml:space="preserve"> should augment human reasoning rather than replace it (Norman 1993; Hutchins 1995). Excessive automation may encourage cognitive offloading that reduces users' engagement with reflection, evaluation, and knowledge construction (Risko and Gilbert 2016). Momeni and Hoeber's finding that grounding AI summaries in searcher-selected highlights preserves metacognitive engagement offers one concrete strategy for managing this tension, but it has not been tested with searchers who have reduced working memory capacity, for whom the assistance-agency balance may need to be struck differently (Momeni and Hoeber 2026; Choi and Arguello 2025).</w:t>
       </w:r>
     </w:p>
     <w:p>
@@ -2519,7 +2907,25 @@
           <w:szCs w:val="24"/>
         </w:rPr>
         <w:lastRenderedPageBreak/>
-        <w:t>The proposed research adopts a design-oriented methodology followed by a user study. The work proceeds in three phases: (1) iterative interface design that externalizes the structural map of an information space and supports metacognitive activities (planning, monitoring, and evaluating), with each design feature justified against a specific problem or literature finding rather than general usability preference; (2) implementation of a working prototype that integrates contextual embedding-based clustering with LLM-generated thematic labels to scaffold cross-session exploratory search; and (3) a controlled user study comparing the proposed scaffolding interface against a baseline. The clustering and summarization components in phase (2) build directly on the interactive cluster refinement and highlight-grounded AI summarization approach validated by Momeni and Hoeber (2026), while the interface's accessibility considerations for working memory and attention draw on the design rationale demonstrated in Seihoon et al.'s SearchPath (2026); the specific technical differences between this prototype and each precedent will be documented as part of the feature-to-problem audit (see Task List). Unlike Momeni and Hoeber's interactive cluster refinement, which organizes and labels resources after they have been saved using lightweight extractive methods (Momeni and Hoeber 2026), the sub-goal and query generation described in the Prototype Design Overview below occur prospectively, before search begins; this thesis therefore uses full LLM generation at the planning stage rather than the extractive labeling validated for post-hoc organization, and the feature-to-problem audit will treat these as addressing different points in the search process rather than as directly comparable techniques. The study will probe how the scaffolding influences search behavior, sensemaking, and perceived cognitive load, with particular attention to differences across individuals with varying working memory capacity.</w:t>
+        <w:t xml:space="preserve">The proposed research adopts a design-oriented methodology followed by a user study. The work proceeds in three phases: (1) iterative interface design that externalizes the structural map of an information space and supports metacognitive activities (planning, monitoring, and evaluating), with each design feature justified against a specific problem or literature finding rather than general usability preference; (2) implementation of a working prototype that integrates contextual embedding-based clustering with LLM-generated thematic labels to scaffold cross-session exploratory search; and (3) a controlled user study comparing the proposed scaffolding interface against a baseline. The clustering and summarization components in phase (2) build directly on the interactive cluster refinement and highlight-grounded AI summarization approach validated by Momeni and Hoeber (2026), while the interface's accessibility considerations for working memory and attention draw on the design rationale demonstrated in Seihoon et al.'s SearchPath (2026); the specific technical differences between this prototype and each precedent will be documented as part of the feature-to-problem audit (see Task List). Unlike Momeni and Hoeber's interactive cluster refinement, which organizes and labels resources after they have been saved using lightweight extractive methods (Momeni and Hoeber 2026), the sub-goal and query generation described in the Prototype Design Overview below occur prospectively, before search begins; this thesis therefore uses full LLM generation at the planning stage rather than the extractive labeling validated for post-hoc organization, and the feature-to-problem audit will treat these as addressing different points in the search process rather than as directly comparable techniques. The study will </w:t>
+      </w:r>
+      <w:proofErr w:type="gramStart"/>
+      <w:r>
+        <w:rPr>
+          <w:rFonts w:ascii="Aptos" w:eastAsia="Aptos" w:hAnsi="Aptos" w:cs="Aptos"/>
+          <w:sz w:val="24"/>
+          <w:szCs w:val="24"/>
+        </w:rPr>
+        <w:t>probe</w:t>
+      </w:r>
+      <w:proofErr w:type="gramEnd"/>
+      <w:r>
+        <w:rPr>
+          <w:rFonts w:ascii="Aptos" w:eastAsia="Aptos" w:hAnsi="Aptos" w:cs="Aptos"/>
+          <w:sz w:val="24"/>
+          <w:szCs w:val="24"/>
+        </w:rPr>
+        <w:t xml:space="preserve"> how the scaffolding influences search behavior, sensemaking, and perceived cognitive load, with particular attention to differences across individuals with varying working memory capacity.</w:t>
       </w:r>
     </w:p>
     <w:p>
@@ -2558,7 +2964,25 @@
           <w:sz w:val="24"/>
           <w:szCs w:val="24"/>
         </w:rPr>
-        <w:t xml:space="preserve">The proposed prototype, MINDS (Metacognitive Interface for Navigating Directions &amp; Scaffolding), operationalizes the design principles reviewed above through five linked mechanisms. Each mechanism below is stated with the specific regulatory activity and literature finding it targets, consistent with the feature-to-problem mapping this thesis commits to throughout, and is illustrated by returning to Jamie Chen, the persona introduced in the Illustrative Scenario above. The design targets working memory capacity as a continuous dimension of individual difference (Choi and Arguello 2025) rather than a single diagnosis; Jamie's dyslexia is one documented case where working memory and attention constraints are particularly pronounced (Seihoon et al. 2026; Jamshed et al. 2025; Zhu et al. 2026), not a claim that the system is restricted to users like Jamie. Whether the planned user study screens for working memory capacity directly or recruits specific </w:t>
+        <w:t xml:space="preserve">The proposed prototype, MINDS (Metacognitive Interface for Navigating Directions &amp; Scaffolding), operationalizes the design principles reviewed above through five linked mechanisms. Each mechanism below is stated with the specific regulatory activity and literature finding </w:t>
+      </w:r>
+      <w:proofErr w:type="gramStart"/>
+      <w:r>
+        <w:rPr>
+          <w:rFonts w:ascii="Aptos" w:eastAsia="Aptos" w:hAnsi="Aptos" w:cs="Aptos"/>
+          <w:sz w:val="24"/>
+          <w:szCs w:val="24"/>
+        </w:rPr>
+        <w:t>it</w:t>
+      </w:r>
+      <w:proofErr w:type="gramEnd"/>
+      <w:r>
+        <w:rPr>
+          <w:rFonts w:ascii="Aptos" w:eastAsia="Aptos" w:hAnsi="Aptos" w:cs="Aptos"/>
+          <w:sz w:val="24"/>
+          <w:szCs w:val="24"/>
+        </w:rPr>
+        <w:t xml:space="preserve"> targets, consistent with the feature-to-problem mapping this thesis commits to throughout, and is illustrated by returning to Jamie Chen, the persona introduced in the Illustrative Scenario above. The design targets working memory capacity as a continuous dimension of individual difference (Choi and Arguello 2025) rather than a single diagnosis; Jamie's dyslexia is one documented case where working memory and attention constraints are particularly pronounced (Seihoon et al. 2026; Jamshed et al. 2025; Zhu et al. 2026), not a claim that the system is restricted to users like Jamie. Whether the planned user study screens for working memory capacity directly or recruits specific </w:t>
       </w:r>
       <w:r>
         <w:rPr>
@@ -2610,7 +3034,25 @@
           <w:sz w:val="24"/>
           <w:szCs w:val="24"/>
         </w:rPr>
-        <w:t>At the start of a project, the searcher enters a search goal, what they already know, and what they want to find out. For Jamie, this means entering the assigned topic (how green spaces affect well-being), along with what Jamie already knows from the course module and what remains unclear. The system then uses an LLM to auto-generate a set of candidate search directions (sub-goals) — for Jamie, an initial set such as physical health benefits, mental health benefits, and community access — from which the searcher selects and to which they can add further directions; this is also where Jamie can add the policy dimension once it becomes apparent partway through the search, without having to reconstruct the original goal structure from memory first. This externalizes the goal-setting and strategy-identification activity that Crescenzi et al. treat as part of planning (Crescenzi et al. 2021), while reducing the working-memory cost of unaided goal decomposition, directly addressing evidence that working memory capacity constrains how searchers plan and structure complex tasks (Choi and Arguello 2025). This is also where the Implementation Note below applies Urgo and Arguello's finding that the quality of a searcher's self-set goals shapes downstream outcomes, as supporting evidence for investing in a capable generative model at this specific step (Urgo and Arguello 2024).</w:t>
+        <w:t xml:space="preserve">At the start of a project, the searcher enters a search goal, what they already know, and what they want to find out. For Jamie, this means entering the assigned topic (how green spaces affect well-being), along with what Jamie already knows from the course module and what remains unclear. The system then uses an LLM to auto-generate a set of candidate search directions (sub-goals) — for Jamie, an initial set such as physical health benefits, mental health benefits, and community access — from which the searcher selects and to which they can add further directions; this is also where Jamie can add the policy dimension once it becomes apparent partway through the search, without having to reconstruct the original goal structure from memory first. This externalizes the </w:t>
+      </w:r>
+      <w:proofErr w:type="gramStart"/>
+      <w:r>
+        <w:rPr>
+          <w:rFonts w:ascii="Aptos" w:eastAsia="Aptos" w:hAnsi="Aptos" w:cs="Aptos"/>
+          <w:sz w:val="24"/>
+          <w:szCs w:val="24"/>
+        </w:rPr>
+        <w:t>goal-setting</w:t>
+      </w:r>
+      <w:proofErr w:type="gramEnd"/>
+      <w:r>
+        <w:rPr>
+          <w:rFonts w:ascii="Aptos" w:eastAsia="Aptos" w:hAnsi="Aptos" w:cs="Aptos"/>
+          <w:sz w:val="24"/>
+          <w:szCs w:val="24"/>
+        </w:rPr>
+        <w:t xml:space="preserve"> and strategy-identification activity that Crescenzi et al. treat as part of planning (Crescenzi et al. 2021), while reducing the working-memory cost of unaided goal decomposition, directly addressing evidence that working memory capacity constrains how searchers plan and structure complex tasks (Choi and Arguello 2025). This is also where the Implementation Note below applies Urgo and Arguello's finding that the quality of a searcher's self-set goals shapes downstream outcomes, as supporting evidence for investing in a capable generative model at this specific step (Urgo and Arguello 2024).</w:t>
       </w:r>
     </w:p>
     <w:p>
@@ -2709,7 +3151,41 @@
           <w:sz w:val="24"/>
           <w:szCs w:val="24"/>
         </w:rPr>
-        <w:t xml:space="preserve">Within the search results page, each result displays a relevance category — Excellent Match, Good Match, Possible Match, or No Match — tied to the active search direction, encoded with increasing colour intensity from pale to saturated green, along with matched keyword tags. This categorical encoding is a deliberate design choice rather than a simplification of a numeric score: a percentage still requires the searcher to read and interpret a number, and numbers impose their own reading and comparison cost on top of </w:t>
+        <w:t xml:space="preserve">Within the search results page, each result displays a relevance category, such as Excellent Match, Good Match, Possible Match, or No Match, tied to the active search direction, encoded with increasing </w:t>
+      </w:r>
+      <w:proofErr w:type="spellStart"/>
+      <w:r>
+        <w:rPr>
+          <w:rFonts w:ascii="Aptos" w:eastAsia="Aptos" w:hAnsi="Aptos" w:cs="Aptos"/>
+          <w:sz w:val="24"/>
+          <w:szCs w:val="24"/>
+        </w:rPr>
+        <w:t>colour</w:t>
+      </w:r>
+      <w:proofErr w:type="spellEnd"/>
+      <w:r>
+        <w:rPr>
+          <w:rFonts w:ascii="Aptos" w:eastAsia="Aptos" w:hAnsi="Aptos" w:cs="Aptos"/>
+          <w:sz w:val="24"/>
+          <w:szCs w:val="24"/>
+        </w:rPr>
+        <w:t xml:space="preserve"> intensity from pale to saturated green, along with matched keyword tags.</w:t>
+      </w:r>
+      <w:r>
+        <w:rPr>
+          <w:rFonts w:ascii="Aptos" w:eastAsia="Aptos" w:hAnsi="Aptos" w:cs="Aptos"/>
+          <w:sz w:val="24"/>
+          <w:szCs w:val="24"/>
+        </w:rPr>
+        <w:t xml:space="preserve"> </w:t>
+      </w:r>
+      <w:r>
+        <w:rPr>
+          <w:rFonts w:ascii="Aptos" w:eastAsia="Aptos" w:hAnsi="Aptos" w:cs="Aptos"/>
+          <w:sz w:val="24"/>
+          <w:szCs w:val="24"/>
+        </w:rPr>
+        <w:t xml:space="preserve">This categorical encoding is a deliberate design choice rather than a simplification of a numeric score: a percentage still requires the searcher to read and interpret a number, and numbers impose their own reading and comparison cost on </w:t>
       </w:r>
       <w:r>
         <w:rPr>
@@ -2718,7 +3194,25 @@
           <w:szCs w:val="24"/>
         </w:rPr>
         <w:lastRenderedPageBreak/>
-        <w:t>the cost of reading the result itself. Where Jamie would otherwise need to read further into each of a dozen results to judge its relevance to a sub-goal, as in the Illustrative Scenario, the category label and colour let Jamie interpret probable relevance at a glance without reading the full result or decoding a numeric score. This is a visualization technique, not a memory-retrieval cue in the encoding-specificity sense discussed under Cross-Session Reacquaintance below, and it reduces the within-session working memory cost of evaluation and monitoring more generally (Choi and Arguello 2025; Crescenzi et al. 2021). It extends prior visualization-based scaffolding that transforms hidden relationships into perceptually available representations, such as Visual Keyword/Result Linking (Hoeber, Pirmoradi, et al. 2024) and visually linked keywords (Hoeber and Shukla 2021), to a compact categorical-and-colour encoding of relevance. Consistent with the design philosophy adopted throughout this review, the indicator informs judgment rather than replacing it: the searcher still decides whether to save each result.</w:t>
+        <w:t xml:space="preserve">top of the cost of reading the result itself. Where Jamie would otherwise need to read further into each of a dozen results to judge its relevance to a sub-goal, as in the Illustrative Scenario, the category label and colour let Jamie interpret probable relevance </w:t>
+      </w:r>
+      <w:proofErr w:type="gramStart"/>
+      <w:r>
+        <w:rPr>
+          <w:rFonts w:ascii="Aptos" w:eastAsia="Aptos" w:hAnsi="Aptos" w:cs="Aptos"/>
+          <w:sz w:val="24"/>
+          <w:szCs w:val="24"/>
+        </w:rPr>
+        <w:t>at a glance</w:t>
+      </w:r>
+      <w:proofErr w:type="gramEnd"/>
+      <w:r>
+        <w:rPr>
+          <w:rFonts w:ascii="Aptos" w:eastAsia="Aptos" w:hAnsi="Aptos" w:cs="Aptos"/>
+          <w:sz w:val="24"/>
+          <w:szCs w:val="24"/>
+        </w:rPr>
+        <w:t xml:space="preserve"> without reading the full result or decoding a numeric score. This is a visualization technique, not a memory-retrieval cue in the encoding-specificity sense discussed under Cross-Session Reacquaintance below, and it reduces the within-session working memory cost of evaluation and monitoring more generally (Choi and Arguello 2025; Crescenzi et al. 2021). It extends prior visualization-based scaffolding that transforms hidden relationships into perceptually available representations, such as Visual Keyword/Result Linking (Hoeber, Pirmoradi, et al. 2024) and visually linked keywords (Hoeber and Shukla 2021), to a compact categorical-and-colour encoding of relevance. Consistent with the design philosophy adopted throughout this review, the indicator informs judgment rather than replacing it: the searcher still decides whether to save each result.</w:t>
       </w:r>
     </w:p>
     <w:p>
@@ -2856,7 +3350,25 @@
           <w:sz w:val="24"/>
           <w:szCs w:val="24"/>
         </w:rPr>
-        <w:t>When Jamie returns after the two-day interruption described in the Illustrative Scenario, the Recap view provides the retrieval cues this thesis grounds in the encoding specificity principle: Tulving and Thomson show that retrieval succeeds when the cues present at encoding are reinstated at the time of retrieval, rather than when the to-be-remembered information is presented on its own (Tulving and Thomson 1973). The Recap view reinstates the elements that were present when Jamie originally encoded the search activity: an Overall summary restates the search goal and each sub-goal's coverage relative to what was originally planned; Last Actions restates the specific query, direction, and result last engaged with; and the session-by-session history restates what was saved, reviewed, and why the prior session stopped. It is the combination of these three, rather than any single element, that reinstates the goal structure, the specific activity, and the stopping context present at encoding, which is what the principle predicts Jamie needs in order to reconstruct that prior mental state, rather than only regaining access to the sources already saved. A condensed version of the same cues appears in the resumption prompt shown when Jamie returns to the tool. This design choice follows directly from evidence that reducing reliance on dense text benefits searchers with dyslexia specifically (Seihoon et al. 2026), and extends the task-resumption function validated by Momeni and Hoeber's timeline and summary mechanisms to a compact, cue-based format (Momeni and Hoeber 2026).</w:t>
+        <w:t>When Jamie returns after the two-day interruption described in the Illustrative Scenario, the Recap view provides the retrieval cues this thesis grounds in the encoding specificity principle: Tulving and Thomson show that retrieval succeeds when the cues present at encoding are reinstated at the time of retrieval, rather than when the to-be-remembered information is presented on its own (Tulving and Thomson 1973). The Recap view reinstates the elements that were present when Jamie originally encoded the search activity: an Overall summary restates the search goal and each sub-goal's coverage relative to what was originally planned; Last Actions restates the specific query, direction, and result last engaged with; and the session-by-session history restates what was saved, reviewed, and why the prior session stopped. It is the combination of these three, rather than any single element, that reinstates the goal structure, the specific activity, and the stopping context present at encoding, which is what the principle predicts Jamie needs in order to reconstruct that prior mental state, rather than only regaining access to the sources already saved. A condensed version of the same cues appears in the resumption prompt shown when Jamie returns to the tool. This design choice follows directly from evidence that reducing reliance on dense text benefits searchers with dyslexia specifically (Seihoon et al. 2026</w:t>
+      </w:r>
+      <w:proofErr w:type="gramStart"/>
+      <w:r>
+        <w:rPr>
+          <w:rFonts w:ascii="Aptos" w:eastAsia="Aptos" w:hAnsi="Aptos" w:cs="Aptos"/>
+          <w:sz w:val="24"/>
+          <w:szCs w:val="24"/>
+        </w:rPr>
+        <w:t>), and</w:t>
+      </w:r>
+      <w:proofErr w:type="gramEnd"/>
+      <w:r>
+        <w:rPr>
+          <w:rFonts w:ascii="Aptos" w:eastAsia="Aptos" w:hAnsi="Aptos" w:cs="Aptos"/>
+          <w:sz w:val="24"/>
+          <w:szCs w:val="24"/>
+        </w:rPr>
+        <w:t xml:space="preserve"> extends the task-resumption function validated by Momeni and Hoeber's timeline and summary mechanisms to a compact, cue-based format (Momeni and Hoeber 2026).</w:t>
       </w:r>
     </w:p>
     <w:p>
@@ -2899,7 +3411,25 @@
           <w:sz w:val="24"/>
           <w:szCs w:val="24"/>
         </w:rPr>
-        <w:t>The four AI-driven components of MINDS require different underlying techniques rather than a single model applied uniformly, and this distinction is treated as a design decision in its own right rather than an implementation detail to be settled later. Sub-goal generation shapes the planning step that Urgo and Arguello show influences a searcher's downstream outcomes (Urgo and Arguello 2024), and therefore warrants a capable generative model: for a searcher like Jamie, a shallow or generic set of sub-goals at this step could mean a dimension of the topic, such as the policy angle in the Illustrative Scenario, never surfaces as an option to add, undermining the goal-setting activity the rest of the design depends on. Query generation is a narrower, more mechanical task and can use a lighter, faster generative model without a meaningful loss of quality, since it does not carry the same downstream weight.</w:t>
+        <w:t xml:space="preserve">The four AI-driven components of MINDS require different underlying techniques rather than a single model applied uniformly, and this distinction is treated as a design decision </w:t>
+      </w:r>
+      <w:proofErr w:type="gramStart"/>
+      <w:r>
+        <w:rPr>
+          <w:rFonts w:ascii="Aptos" w:eastAsia="Aptos" w:hAnsi="Aptos" w:cs="Aptos"/>
+          <w:sz w:val="24"/>
+          <w:szCs w:val="24"/>
+        </w:rPr>
+        <w:t>in its own right rather</w:t>
+      </w:r>
+      <w:proofErr w:type="gramEnd"/>
+      <w:r>
+        <w:rPr>
+          <w:rFonts w:ascii="Aptos" w:eastAsia="Aptos" w:hAnsi="Aptos" w:cs="Aptos"/>
+          <w:sz w:val="24"/>
+          <w:szCs w:val="24"/>
+        </w:rPr>
+        <w:t xml:space="preserve"> than an implementation detail to be settled later. Sub-goal generation shapes the planning step that Urgo and Arguello show influences a searcher's downstream outcomes (Urgo and Arguello 2024), and therefore warrants a capable generative model: for a searcher like Jamie, a shallow or generic set of sub-goals at this step could mean a dimension of the topic, such as the policy angle in the Illustrative Scenario, never surfaces as an option to add, undermining the goal-setting activity the rest of the design depends on. Query generation is a narrower, more mechanical task and can use a lighter, faster generative model without a meaningful loss of quality, since it does not carry the same downstream weight.</w:t>
       </w:r>
     </w:p>
     <w:p>
@@ -2944,7 +3474,25 @@
           <w:sz w:val="24"/>
           <w:szCs w:val="24"/>
         </w:rPr>
-        <w:t>The Overall, Last Actions, and Sessions summaries on the Recap page introduce a distinct risk: because they report specific counts, deltas, and session details, an unconstrained generative model could misstate a number it was only meant to describe. To avoid this, all counts, deltas, and coverage figures are computed deterministically outside the generative model, and the model is used only to phrase these already-resolved values into natural sentences, never to calculate them; this mirrors the structured, low-temperature summarization approach that Momeni and Hoeber validate for their AI-generated workspace summaries (Momeni and Hoeber 2026). This separation between computation and phrasing is treated as a testable implementation requirement rather than an assumption, to be verified during implementation as the prototype is built.</w:t>
+        <w:t xml:space="preserve">The Overall, Last Actions, and </w:t>
+      </w:r>
+      <w:proofErr w:type="gramStart"/>
+      <w:r>
+        <w:rPr>
+          <w:rFonts w:ascii="Aptos" w:eastAsia="Aptos" w:hAnsi="Aptos" w:cs="Aptos"/>
+          <w:sz w:val="24"/>
+          <w:szCs w:val="24"/>
+        </w:rPr>
+        <w:t>Sessions</w:t>
+      </w:r>
+      <w:proofErr w:type="gramEnd"/>
+      <w:r>
+        <w:rPr>
+          <w:rFonts w:ascii="Aptos" w:eastAsia="Aptos" w:hAnsi="Aptos" w:cs="Aptos"/>
+          <w:sz w:val="24"/>
+          <w:szCs w:val="24"/>
+        </w:rPr>
+        <w:t xml:space="preserve"> summaries on the Recap page introduce a distinct risk: because they report specific counts, deltas, and session details, an unconstrained generative model could misstate a number it was only meant to describe. To avoid this, all counts, deltas, and coverage figures are computed deterministically outside the generative model, and the model is used only to phrase these already-resolved values into natural sentences, never to calculate them; this mirrors the structured, low-temperature summarization approach that Momeni and Hoeber validate for their AI-generated workspace summaries (Momeni and Hoeber 2026). This separation between computation and phrasing is treated as a testable implementation requirement rather than an assumption, to be verified during implementation as the prototype is built.</w:t>
       </w:r>
     </w:p>
     <w:p>
@@ -3365,7 +3913,25 @@
           <w:sz w:val="24"/>
           <w:szCs w:val="24"/>
         </w:rPr>
-        <w:t>Map each MINDS feature to the specific metacognitive activity it targets (planning, monitoring, or evaluating), grounded in how the MVP actually implements it rather than in the original design intent alone.</w:t>
+        <w:t xml:space="preserve">Map each MINDS feature to the specific metacognitive activity it targets (planning, monitoring, or evaluating), grounded in how the MVP </w:t>
+      </w:r>
+      <w:proofErr w:type="gramStart"/>
+      <w:r>
+        <w:rPr>
+          <w:rFonts w:ascii="Aptos" w:eastAsia="Aptos" w:hAnsi="Aptos" w:cs="Aptos"/>
+          <w:sz w:val="24"/>
+          <w:szCs w:val="24"/>
+        </w:rPr>
+        <w:t>actually implements</w:t>
+      </w:r>
+      <w:proofErr w:type="gramEnd"/>
+      <w:r>
+        <w:rPr>
+          <w:rFonts w:ascii="Aptos" w:eastAsia="Aptos" w:hAnsi="Aptos" w:cs="Aptos"/>
+          <w:sz w:val="24"/>
+          <w:szCs w:val="24"/>
+        </w:rPr>
+        <w:t xml:space="preserve"> it rather than in the original design intent alone.</w:t>
       </w:r>
     </w:p>
     <w:p>
@@ -3692,7 +4258,43 @@
           <w:sz w:val="24"/>
           <w:szCs w:val="24"/>
         </w:rPr>
-        <w:t>Validate the relevance-category similarity thresholds (Excellent Match, Good Match, Possible Match, No Match) against searchers' own judgments of result relevance during the cognitive walkthroughs, and recalibrate them if the displayed categories do not match what searchers actually judge as relevant.</w:t>
+        <w:t xml:space="preserve">Validate the relevance-category similarity thresholds (Excellent Match, Good Match, Possible Match, No Match) against searchers' own judgments of result relevance during the cognitive </w:t>
+      </w:r>
+      <w:proofErr w:type="gramStart"/>
+      <w:r>
+        <w:rPr>
+          <w:rFonts w:ascii="Aptos" w:eastAsia="Aptos" w:hAnsi="Aptos" w:cs="Aptos"/>
+          <w:sz w:val="24"/>
+          <w:szCs w:val="24"/>
+        </w:rPr>
+        <w:t>walkthroughs, and</w:t>
+      </w:r>
+      <w:proofErr w:type="gramEnd"/>
+      <w:r>
+        <w:rPr>
+          <w:rFonts w:ascii="Aptos" w:eastAsia="Aptos" w:hAnsi="Aptos" w:cs="Aptos"/>
+          <w:sz w:val="24"/>
+          <w:szCs w:val="24"/>
+        </w:rPr>
+        <w:t xml:space="preserve"> recalibrate them if the displayed categories do not match what searchers </w:t>
+      </w:r>
+      <w:proofErr w:type="gramStart"/>
+      <w:r>
+        <w:rPr>
+          <w:rFonts w:ascii="Aptos" w:eastAsia="Aptos" w:hAnsi="Aptos" w:cs="Aptos"/>
+          <w:sz w:val="24"/>
+          <w:szCs w:val="24"/>
+        </w:rPr>
+        <w:t>actually judge</w:t>
+      </w:r>
+      <w:proofErr w:type="gramEnd"/>
+      <w:r>
+        <w:rPr>
+          <w:rFonts w:ascii="Aptos" w:eastAsia="Aptos" w:hAnsi="Aptos" w:cs="Aptos"/>
+          <w:sz w:val="24"/>
+          <w:szCs w:val="24"/>
+        </w:rPr>
+        <w:t xml:space="preserve"> as relevant.</w:t>
       </w:r>
     </w:p>
     <w:p>
@@ -4322,7 +4924,25 @@
           <w:sz w:val="22"/>
           <w:szCs w:val="22"/>
         </w:rPr>
-        <w:t>[13] Li, Yuan and Crescenzi, Anita and Ward, Austin R. and Capra, Rob (2021). Thinking Inside the Box: An Evaluation of A Novel Search-Assisting Tool. University of North Carolina at Chapel Hill.</w:t>
+        <w:t xml:space="preserve">[13] Li, Yuan and Crescenzi, Anita and Ward, Austin R. and Capra, Rob (2021). Thinking Inside the Box: An Evaluation of </w:t>
+      </w:r>
+      <w:proofErr w:type="gramStart"/>
+      <w:r>
+        <w:rPr>
+          <w:rFonts w:ascii="Aptos" w:eastAsia="Aptos" w:hAnsi="Aptos" w:cs="Aptos"/>
+          <w:sz w:val="22"/>
+          <w:szCs w:val="22"/>
+        </w:rPr>
+        <w:t>A</w:t>
+      </w:r>
+      <w:proofErr w:type="gramEnd"/>
+      <w:r>
+        <w:rPr>
+          <w:rFonts w:ascii="Aptos" w:eastAsia="Aptos" w:hAnsi="Aptos" w:cs="Aptos"/>
+          <w:sz w:val="22"/>
+          <w:szCs w:val="22"/>
+        </w:rPr>
+        <w:t xml:space="preserve"> Novel Search-Assisting Tool. University of North Carolina at Chapel Hill.</w:t>
       </w:r>
     </w:p>
     <w:p>
@@ -4436,7 +5056,25 @@
           <w:sz w:val="22"/>
           <w:szCs w:val="22"/>
         </w:rPr>
-        <w:t>[19] Kelsey Urgo and Jaime Arguello (2024). The Effects of Goal-setting on Learning Outcomes and Self-Regulated Learning Processes. Proceedings of the 2024 ACM SIGIR Conference on Human Information Interaction and Retrieval (CHIIR '24).</w:t>
+        <w:t xml:space="preserve">[19] Kelsey Urgo and Jaime Arguello (2024). The Effects of </w:t>
+      </w:r>
+      <w:proofErr w:type="gramStart"/>
+      <w:r>
+        <w:rPr>
+          <w:rFonts w:ascii="Aptos" w:eastAsia="Aptos" w:hAnsi="Aptos" w:cs="Aptos"/>
+          <w:sz w:val="22"/>
+          <w:szCs w:val="22"/>
+        </w:rPr>
+        <w:t>Goal-setting</w:t>
+      </w:r>
+      <w:proofErr w:type="gramEnd"/>
+      <w:r>
+        <w:rPr>
+          <w:rFonts w:ascii="Aptos" w:eastAsia="Aptos" w:hAnsi="Aptos" w:cs="Aptos"/>
+          <w:sz w:val="22"/>
+          <w:szCs w:val="22"/>
+        </w:rPr>
+        <w:t xml:space="preserve"> on Learning Outcomes and Self-Regulated Learning Processes. Proceedings of the 2024 ACM SIGIR Conference on Human Information Interaction and Retrieval (CHIIR '24).</w:t>
       </w:r>
     </w:p>
     <w:p>

</xml_diff>